<commit_message>
Updated posted sales invoice and credit memo layout; removed runtime from app.json.
</commit_message>
<xml_diff>
--- a/Group Bornholm Salgsfaktura.docx
+++ b/Group Bornholm Salgsfaktura.docx
@@ -1358,16 +1358,15 @@
             </w:r>
             <w:sdt>
               <w:sdtPr>
-                <w:alias w:val="#Nav: /Header/Totals/IncludingVATLine"/>
-                <w:tag w:val="#Nav: Standard_Sales_Invoice/1306"/>
-                <w:id w:val="1596986564"/>
+                <w:id w:val="1543793221"/>
                 <w:placeholder>
                   <w:docPart w:val="DefaultPlaceholder_-1854013440"/>
                 </w:placeholder>
                 <w:dataBinding w:prefixMappings="xmlns:ns0='urn:microsoft-dynamics-nav/reports/Standard_Sales_Invoice/1306/'" w:xpath="/ns0:NavWordReportXmlPart[1]/ns0:Header[1]/ns0:Totals[1]/ns0:IncludingVATLine[1]" w:storeItemID="{8BCD1D8D-B23A-4084-822F-E250965334AB}"/>
                 <w:text/>
+                <w:alias w:val="#Nav: /Header/Totals/IncludingVATLine"/>
+                <w:tag w:val="#Nav: Standard_Sales_Invoice/1306"/>
               </w:sdtPr>
-              <w:sdtEndPr/>
               <w:sdtContent>
                 <w:proofErr w:type="spellStart"/>
                 <w:r>
@@ -1500,15 +1499,13 @@
       <w:tr>
         <w:sdt>
           <w:sdtPr>
-            <w:rPr>
-              <w:lang w:val="da-DK"/>
-            </w:rPr>
             <w:id w:val="1343902866"/>
             <w:placeholder>
               <w:docPart w:val="DefaultPlaceholder_-1854013440"/>
             </w:placeholder>
             <w15:dataBinding w:prefixMappings="xmlns:ns0='urn:microsoft-dynamics-nav/reports/Standard_Sales_Invoice/1306/' " w:xpath="/ns0:NavWordReportXmlPart[1]/ns0:Header[1]/ns0:MessageLine1[1]" w:storeItemID="{8BCD1D8D-B23A-4084-822F-E250965334AB}" w16sdtdh:storeItemChecksum="pmxw7Q=="/>
           </w:sdtPr>
+          <w:sdtEndPr/>
           <w:sdtContent>
             <w:tc>
               <w:tcPr>
@@ -1931,7 +1928,7 @@
               <w:b/>
               <w:bCs/>
             </w:rPr>
-            <w:t>964</w:t>
+            <w:t>3680</w:t>
           </w:r>
         </w:p>
       </w:tc>
@@ -4117,12 +4114,14 @@
     <w:rsid w:val="001333C3"/>
     <w:rsid w:val="00133ACB"/>
     <w:rsid w:val="00153754"/>
+    <w:rsid w:val="0017216A"/>
     <w:rsid w:val="0018016C"/>
     <w:rsid w:val="0018162E"/>
     <w:rsid w:val="001C287B"/>
     <w:rsid w:val="001C3916"/>
     <w:rsid w:val="001C3DDB"/>
     <w:rsid w:val="001E081C"/>
+    <w:rsid w:val="001E5E19"/>
     <w:rsid w:val="001F7768"/>
     <w:rsid w:val="00215021"/>
     <w:rsid w:val="00217D43"/>
@@ -4135,6 +4134,7 @@
     <w:rsid w:val="002D1F33"/>
     <w:rsid w:val="002F06F9"/>
     <w:rsid w:val="002F130C"/>
+    <w:rsid w:val="002F17E8"/>
     <w:rsid w:val="002F2925"/>
     <w:rsid w:val="00301F7F"/>
     <w:rsid w:val="003157E0"/>
@@ -4263,6 +4263,7 @@
     <w:rsid w:val="00BE5F97"/>
     <w:rsid w:val="00C04221"/>
     <w:rsid w:val="00C17C74"/>
+    <w:rsid w:val="00C505E0"/>
     <w:rsid w:val="00C54F3B"/>
     <w:rsid w:val="00C72273"/>
     <w:rsid w:val="00CA0A68"/>

</xml_diff>